<commit_message>
1.5. Se agregan agentes, docs y BD
docs: agregar documentación de agentes y actualizar artefactos de FadeBooker

- Nuevo: .github/AGENTS.md, AGENTS_USER_GUIDE.md, ANALISIS_SQL_INCONGRUENCIAS.md
- Nuevo: instrucciones por agente en .github/agents/
- Nuevo: script temp_read_excel.py
- Nuevo: múltiples documentos en Documentación/ (Excel, Word, PDF, imágenes, HTML)
- Actualizado: EDT, Evidencias, Definición de Responsabilidades, Investigaciones, MATRIZ DE RIESGOS
</commit_message>
<xml_diff>
--- a/Documentación/Documentos/Investigaciones.docx
+++ b/Documentación/Documentos/Investigaciones.docx
@@ -41,7 +41,7 @@
           <w:pgNumType w:start="1"/>
         </w:sectPr>
       </w:pPr>
-      <w:bookmarkStart w:colFirst="0" w:colLast="0" w:name="_jxtfrzym6ows" w:id="0"/>
+      <w:bookmarkStart w:colFirst="0" w:colLast="0" w:name="_bietin13y2va" w:id="0"/>
       <w:bookmarkEnd w:id="0"/>
       <w:r>
         <w:rPr>
@@ -334,7 +334,7 @@
           <w:pgNumType w:start="1"/>
         </w:sectPr>
       </w:pPr>
-      <w:bookmarkStart w:colFirst="0" w:colLast="0" w:name="_ewjx9pht4afo" w:id="2"/>
+      <w:bookmarkStart w:colFirst="0" w:colLast="0" w:name="_xyvn5pnleg5e" w:id="2"/>
       <w:bookmarkEnd w:id="2"/>
       <w:r>
         <w:rPr>
@@ -2063,7 +2063,7 @@
           <w:pgNumType w:start="1"/>
         </w:sectPr>
       </w:pPr>
-      <w:bookmarkStart w:colFirst="0" w:colLast="0" w:name="_i34b57q1p7jz" w:id="3"/>
+      <w:bookmarkStart w:colFirst="0" w:colLast="0" w:name="_8zv24i9s9d5v" w:id="3"/>
       <w:bookmarkEnd w:id="3"/>
       <w:r>
         <w:rPr>
@@ -3787,7 +3787,7 @@
           <w:pgNumType w:start="1"/>
         </w:sectPr>
       </w:pPr>
-      <w:bookmarkStart w:colFirst="0" w:colLast="0" w:name="_6r5wtizbo3ic" w:id="19"/>
+      <w:bookmarkStart w:colFirst="0" w:colLast="0" w:name="_kisifo1xhhkq" w:id="19"/>
       <w:bookmarkEnd w:id="19"/>
       <w:r>
         <w:rPr>
@@ -18002,7 +18002,7 @@
           <w:pgNumType w:start="1"/>
         </w:sectPr>
       </w:pPr>
-      <w:bookmarkStart w:colFirst="0" w:colLast="0" w:name="_mg38nkbyq31" w:id="39"/>
+      <w:bookmarkStart w:colFirst="0" w:colLast="0" w:name="_r24vm0fmruai" w:id="39"/>
       <w:bookmarkEnd w:id="39"/>
       <w:r>
         <w:rPr>

</xml_diff>